<commit_message>
Polish for submission: high-risk reframe, side-by-side example, screenshot, gitignore cleanup
</commit_message>
<xml_diff>
--- a/Report/report.docx
+++ b/Report/report.docx
@@ -2,7 +2,7 @@
 <file path=word/document.xml><?xml version="1.0" encoding="utf-8"?>
 <w:document xmlns:w="http://schemas.openxmlformats.org/wordprocessingml/2006/main" xmlns:m="http://schemas.openxmlformats.org/officeDocument/2006/math" xmlns:r="http://schemas.openxmlformats.org/officeDocument/2006/relationships" xmlns:o="urn:schemas-microsoft-com:office:office" xmlns:v="urn:schemas-microsoft-com:vml" xmlns:w10="urn:schemas-microsoft-com:office:word" xmlns:a="http://schemas.openxmlformats.org/drawingml/2006/main" xmlns:pic="http://schemas.openxmlformats.org/drawingml/2006/picture" xmlns:wp="http://schemas.openxmlformats.org/drawingml/2006/wordprocessingDrawing">
   <w:body>
-    <w:bookmarkStart w:id="29" w:name="Xdb613d40d699a679dea235e5e1e52c850e0cea8"/>
+    <w:bookmarkStart w:id="30" w:name="Xdb613d40d699a679dea235e5e1e52c850e0cea8"/>
     <w:p>
       <w:pPr>
         <w:pStyle w:val="Heading1"/>
@@ -114,7 +114,23 @@
         <w:t xml:space="preserve"> </w:t>
       </w:r>
       <w:r>
-        <w:t xml:space="preserve">— specialist agents per data domain coordinated by an orchestrator — produces more grounded, domain-specific insights than single-shot prompting on identical data. We implement both architectures in an iOS application using GPT-4o-mini, evaluate them on a 7-day longitudinal personal dataset spanning nutrition, training, and recovery signals, and report on grounding rate, cross-domain integration rate, and qualitative differences across the two modes. Our results show that both architectures achieve 100% grounding with no observed hallucinated values, but multi-agent eliminates the run-to-run variance in cross-domain integration that single-shot exhibits (multi-agent: 100% vs single-shot: 76%, with one single-shot run as low as 40%). This consistency comes at a cost of 2.66× tokens and 1.42× latency. The headline finding is not that multi-agent produces better individual insights, but that it produces</w:t>
+        <w:t xml:space="preserve">— specialist agents per data domain coordinated by an orchestrator — produces more grounded, domain-specific insights than single-shot prompting on identical data.</w:t>
+      </w:r>
+      <w:r>
+        <w:t xml:space="preserve"> </w:t>
+      </w:r>
+      <w:r>
+        <w:rPr>
+          <w:b/>
+          <w:bCs/>
+        </w:rPr>
+        <w:t xml:space="preserve">The high-risk choice in this project was to implement and evaluate the architectures inside a fully working native iOS application against the author’s own self-tracked personal health data, rather than as a Jupyter notebook against a public benchmark.</w:t>
+      </w:r>
+      <w:r>
+        <w:t xml:space="preserve"> </w:t>
+      </w:r>
+      <w:r>
+        <w:t xml:space="preserve">This decision accepted three concrete risks: (1) the iOS engineering effort would crowd out research depth, (2) N=1 personal data has no ground truth and limits generalizability, and (3) running the eval through real API calls (rather than cached responses) made every iteration cost real money. We accepted these risks because the goal was to test whether a multi-agent personal health system could plausibly ship as a real consumer product, not just whether it produces a better number on a leaderboard. We implement both architectures in an iOS application using GPT-4o-mini, evaluate them on a 7-day longitudinal personal dataset spanning nutrition, training, and recovery signals, and report on grounding rate, cross-domain integration rate, and qualitative differences across the two modes. Our results show that both architectures achieve 100% grounding with no observed hallucinated values, but multi-agent eliminates the run-to-run variance in cross-domain integration that single-shot exhibits (multi-agent: 100% vs single-shot: 76%, with one single-shot run as low as 40%). This consistency comes at a cost of 2.66× tokens and 1.42× latency. The headline finding is not that multi-agent produces better individual insights, but that it produces</w:t>
       </w:r>
       <w:r>
         <w:t xml:space="preserve"> </w:t>
@@ -509,7 +525,7 @@
     </w:p>
     <w:bookmarkEnd w:id="13"/>
     <w:bookmarkEnd w:id="14"/>
-    <w:bookmarkStart w:id="20" w:name="methodology"/>
+    <w:bookmarkStart w:id="21" w:name="methodology"/>
     <w:p>
       <w:pPr>
         <w:pStyle w:val="Heading2"/>
@@ -1020,7 +1036,7 @@
       </w:r>
     </w:p>
     <w:bookmarkEnd w:id="17"/>
-    <w:bookmarkStart w:id="18" w:name="implementation"/>
+    <w:bookmarkStart w:id="19" w:name="implementation"/>
     <w:p>
       <w:pPr>
         <w:pStyle w:val="Heading3"/>
@@ -1066,6 +1082,28 @@
         <w:pStyle w:val="BodyText"/>
       </w:pPr>
       <w:r>
+        <w:t xml:space="preserve">All source code, evaluation harness, scoring scripts, and per-run output JSONs are publicly available at</w:t>
+      </w:r>
+      <w:r>
+        <w:t xml:space="preserve"> </w:t>
+      </w:r>
+      <w:hyperlink r:id="rId18">
+        <w:r>
+          <w:rPr>
+            <w:rStyle w:val="Hyperlink"/>
+          </w:rPr>
+          <w:t xml:space="preserve">https://github.com/jeromez0/health-insight-agent</w:t>
+        </w:r>
+      </w:hyperlink>
+      <w:r>
+        <w:t xml:space="preserve">. Re-running the eval requires only an OpenAI API key and approximately $0.05 of API credit per full 10-generation run.</w:t>
+      </w:r>
+    </w:p>
+    <w:p>
+      <w:pPr>
+        <w:pStyle w:val="BodyText"/>
+      </w:pPr>
+      <w:r>
         <w:t xml:space="preserve">The UI consists of a single screen with a segmented control to select the inference mode, a scrolling display of the 7-day health data, a</w:t>
       </w:r>
       <w:r>
@@ -1081,8 +1119,8 @@
         <w:t xml:space="preserve">button, and a results card showing the produced insights along with metadata (mode used, total LLM calls, total token usage, wall-clock latency).</w:t>
       </w:r>
     </w:p>
-    <w:bookmarkEnd w:id="18"/>
-    <w:bookmarkStart w:id="19" w:name="evaluation-protocol"/>
+    <w:bookmarkEnd w:id="19"/>
+    <w:bookmarkStart w:id="20" w:name="evaluation-protocol"/>
     <w:p>
       <w:pPr>
         <w:pStyle w:val="Heading3"/>
@@ -1246,9 +1284,9 @@
         </w:pict>
       </w:r>
     </w:p>
-    <w:bookmarkEnd w:id="19"/>
     <w:bookmarkEnd w:id="20"/>
-    <w:bookmarkStart w:id="24" w:name="results"/>
+    <w:bookmarkEnd w:id="21"/>
+    <w:bookmarkStart w:id="25" w:name="results"/>
     <w:p>
       <w:pPr>
         <w:pStyle w:val="Heading2"/>
@@ -1257,7 +1295,7 @@
         <w:t xml:space="preserve">4. Results</w:t>
       </w:r>
     </w:p>
-    <w:bookmarkStart w:id="21" w:name="quantitative-results"/>
+    <w:bookmarkStart w:id="22" w:name="quantitative-results"/>
     <w:p>
       <w:pPr>
         <w:pStyle w:val="Heading3"/>
@@ -1685,8 +1723,8 @@
         <w:t xml:space="preserve">: single-shot achieved 76% cross-domain rate with high run-to-run variance (one run dropped to 40%), while multi-agent maintained 100% cross-domain integration across all five runs. Per-insight density of specific values and dates was comparable across architectures, with single-shot slightly denser on raw count.</w:t>
       </w:r>
     </w:p>
-    <w:bookmarkEnd w:id="21"/>
-    <w:bookmarkStart w:id="22" w:name="qualitative-observations"/>
+    <w:bookmarkEnd w:id="22"/>
+    <w:bookmarkStart w:id="23" w:name="qualitative-observations"/>
     <w:p>
       <w:pPr>
         <w:pStyle w:val="Heading3"/>
@@ -1762,6 +1800,116 @@
         <w:pStyle w:val="BodyText"/>
       </w:pPr>
       <w:r>
+        <w:t xml:space="preserve">To make this concrete, consider one insight from each mode produced on the same 7-day dataset:</w:t>
+      </w:r>
+    </w:p>
+    <w:p>
+      <w:pPr>
+        <w:pStyle w:val="BlockText"/>
+      </w:pPr>
+      <w:r>
+        <w:rPr>
+          <w:b/>
+          <w:bCs/>
+        </w:rPr>
+        <w:t xml:space="preserve">Single-shot, run 5, insight #4 —</w:t>
+      </w:r>
+      <w:r>
+        <w:rPr>
+          <w:b/>
+          <w:bCs/>
+        </w:rPr>
+        <w:t xml:space="preserve"> </w:t>
+      </w:r>
+      <w:r>
+        <w:rPr>
+          <w:b/>
+          <w:bCs/>
+        </w:rPr>
+        <w:t xml:space="preserve">“Fat Intake Trends”</w:t>
+      </w:r>
+      <w:r>
+        <w:rPr>
+          <w:b/>
+          <w:bCs/>
+        </w:rPr>
+        <w:t xml:space="preserve">:</w:t>
+      </w:r>
+      <w:r>
+        <w:t xml:space="preserve"> </w:t>
+      </w:r>
+      <w:r>
+        <w:t xml:space="preserve">“On April 24 and 25, your fat intake was notably high at 107g, with a corresponding increase in saturated fat. This may not align with optimal health guidelines and could impact your overall cardiovascular health. Consider moderating your fat intake, particularly saturated fats, and focus on healthier fat sources.”</w:t>
+      </w:r>
+    </w:p>
+    <w:p>
+      <w:pPr>
+        <w:pStyle w:val="BlockText"/>
+      </w:pPr>
+      <w:r>
+        <w:rPr>
+          <w:b/>
+          <w:bCs/>
+        </w:rPr>
+        <w:t xml:space="preserve">Multi-agent, run 1, insight #3 —</w:t>
+      </w:r>
+      <w:r>
+        <w:rPr>
+          <w:b/>
+          <w:bCs/>
+        </w:rPr>
+        <w:t xml:space="preserve"> </w:t>
+      </w:r>
+      <w:r>
+        <w:rPr>
+          <w:b/>
+          <w:bCs/>
+        </w:rPr>
+        <w:t xml:space="preserve">“Tension Between Nutrition and Recovery”</w:t>
+      </w:r>
+      <w:r>
+        <w:rPr>
+          <w:b/>
+          <w:bCs/>
+        </w:rPr>
+        <w:t xml:space="preserve">:</w:t>
+      </w:r>
+      <w:r>
+        <w:t xml:space="preserve"> </w:t>
+      </w:r>
+      <w:r>
+        <w:t xml:space="preserve">“On April 25, there was a significant drop in carbohydrate intake to 115g and fiber to just 9g, alongside a high sodium intake of 2761mg. Despite maintaining a high training readiness score, the low carbohydrate and fiber levels could negatively impact recovery and overall energy levels, indicating a disconnect between nutritional intake and recovery needs.”</w:t>
+      </w:r>
+    </w:p>
+    <w:p>
+      <w:pPr>
+        <w:pStyle w:val="FirstParagraph"/>
+      </w:pPr>
+      <w:r>
+        <w:t xml:space="preserve">Both insights are grounded — both cite real values from real days. But the single-shot example stays inside the nutrition domain (saturated fat, cardiovascular health). The multi-agent example explicitly names the cross-domain disagreement: high training readiness</w:t>
+      </w:r>
+      <w:r>
+        <w:t xml:space="preserve"> </w:t>
+      </w:r>
+      <w:r>
+        <w:rPr>
+          <w:i/>
+          <w:iCs/>
+        </w:rPr>
+        <w:t xml:space="preserve">despite</w:t>
+      </w:r>
+      <w:r>
+        <w:t xml:space="preserve"> </w:t>
+      </w:r>
+      <w:r>
+        <w:t xml:space="preserve">poor nutritional support, and articulates the implication. This pattern recurs across the runs and is what drives the cross-domain integration rate gap (76% vs 100%) in Table 1.</w:t>
+      </w:r>
+    </w:p>
+    <w:p>
+      <w:pPr>
+        <w:pStyle w:val="BodyText"/>
+      </w:pPr>
+      <w:r>
         <w:rPr>
           <w:b/>
           <w:bCs/>
@@ -1805,8 +1953,8 @@
         <w:t xml:space="preserve">UI rather than discarding them.</w:t>
       </w:r>
     </w:p>
-    <w:bookmarkEnd w:id="22"/>
-    <w:bookmarkStart w:id="23" w:name="cost-and-latency"/>
+    <w:bookmarkEnd w:id="23"/>
+    <w:bookmarkStart w:id="24" w:name="cost-and-latency"/>
     <w:p>
       <w:pPr>
         <w:pStyle w:val="Heading3"/>
@@ -1883,9 +2031,9 @@
         </w:pict>
       </w:r>
     </w:p>
-    <w:bookmarkEnd w:id="23"/>
     <w:bookmarkEnd w:id="24"/>
-    <w:bookmarkStart w:id="27" w:name="conclusion"/>
+    <w:bookmarkEnd w:id="25"/>
+    <w:bookmarkStart w:id="28" w:name="conclusion"/>
     <w:p>
       <w:pPr>
         <w:pStyle w:val="Heading2"/>
@@ -1950,7 +2098,7 @@
         <w:t xml:space="preserve">insights for cross-domain personal health analysis.</w:t>
       </w:r>
     </w:p>
-    <w:bookmarkStart w:id="25" w:name="limitations"/>
+    <w:bookmarkStart w:id="26" w:name="limitations"/>
     <w:p>
       <w:pPr>
         <w:pStyle w:val="Heading3"/>
@@ -2089,8 +2237,8 @@
         <w:t xml:space="preserve">Our specialist agents are hardcoded by domain. A more sophisticated approach might dynamically route data based on the question asked.</w:t>
       </w:r>
     </w:p>
-    <w:bookmarkEnd w:id="25"/>
-    <w:bookmarkStart w:id="26" w:name="future-directions"/>
+    <w:bookmarkEnd w:id="26"/>
+    <w:bookmarkStart w:id="27" w:name="future-directions"/>
     <w:p>
       <w:pPr>
         <w:pStyle w:val="Heading3"/>
@@ -2237,9 +2385,9 @@
         </w:pict>
       </w:r>
     </w:p>
-    <w:bookmarkEnd w:id="26"/>
     <w:bookmarkEnd w:id="27"/>
-    <w:bookmarkStart w:id="28" w:name="references"/>
+    <w:bookmarkEnd w:id="28"/>
+    <w:bookmarkStart w:id="29" w:name="references"/>
     <w:p>
       <w:pPr>
         <w:pStyle w:val="Heading2"/>
@@ -2368,8 +2516,8 @@
         <w:t xml:space="preserve">Code, mock dataset, and reproducible build instructions available at [repository URL].</w:t>
       </w:r>
     </w:p>
-    <w:bookmarkEnd w:id="28"/>
     <w:bookmarkEnd w:id="29"/>
+    <w:bookmarkEnd w:id="30"/>
     <w:sectPr>
       <w:footnotePr>
         <w:numRestart w:val="eachSect"/>

</xml_diff>